<commit_message>
Update CCH log Section 5 with Lisa Machenberg case conference guidance
Added actual supervisor discussion from Oct 7 Case Conference:
- Reframe: symptoms are overload, not the problem
- Three Primary Wounds: abandonment, betrayal, shame
- No negatives in suggestions (8-year-old brain)
- Target emotion + sensory memory + breathe in neuropathway
- Hypnotic intention per wound type
- Same trigger -> new behavior -> superior result
- Hypnotherapist focus: suggestibility, trigger, new behavior

Co-Authored-By: Claude Opus 4.6 (1M context) <noreply@anthropic.com>
</commit_message>
<xml_diff>
--- a/Clients/TM-002/Documents/CCH-Log-S1-2026-10-08.docx
+++ b/Clients/TM-002/Documents/CCH-Log-S1-2026-10-08.docx
@@ -547,7 +547,63 @@
     <w:p/>
     <w:p>
       <w:r>
-        <w:t>I plan to discuss this session with my supervisor (Lisa) to review: (1) the decision to defer formal induction to Session 2, (2) appropriateness of introducing EFT on the first session, (3) how to approach forgiveness and cord cutting given the severity of disclosure, (4) whether a referral to a licensed MHP for concurrent PTSD treatment should be considered.</w:t>
+        <w:t>I discussed this case with Lisa Machenberg (HMI Instructor) at the October 7 Case Conference. Lisa provided the following guidance:</w:t>
+      </w:r>
+    </w:p>
+    <w:p>
+      <w:pPr>
+        <w:pStyle w:val="ListBullet"/>
+      </w:pPr>
+      <w:r>
+        <w:t>Reframe the presenting issues: The anxiety, hypervigilance, and trust difficulties are not the problem — they are symptoms of overload. The brain is mistaking the real danger of the past with the real safety of the present (environmental hypnosis). Treatment should address the overload pattern, not chase individual symptoms.</w:t>
+      </w:r>
+    </w:p>
+    <w:p>
+      <w:pPr>
+        <w:pStyle w:val="ListBullet"/>
+      </w:pPr>
+      <w:r>
+        <w:t>Three Primary Wounds framework: Lisa identified three primary wounds in childhood trauma cases: (1) Abandonment — people supposed to keep you safe could not be present; (2) Betrayal — people supposed to keep you safe hurt you; (3) Shame — you are not who your parents wanted. For T.M., Betrayal and Abandonment are likely primary. Lisa advised asking the client directly which wound feels most profound.</w:t>
+      </w:r>
+    </w:p>
+    <w:p>
+      <w:pPr>
+        <w:pStyle w:val="ListBullet"/>
+      </w:pPr>
+      <w:r>
+        <w:t>No negatives in suggestions: The subconscious has the maturity of an 8-year-old and cannot process negatives. "Don't be anxious" creates a picture of anxiety. Instead, provide positive target imagery. Get the client's own positive words (e.g., "loved" and "joyful") and anchor those.</w:t>
+      </w:r>
+    </w:p>
+    <w:p>
+      <w:pPr>
+        <w:pStyle w:val="ListBullet"/>
+      </w:pPr>
+      <w:r>
+        <w:t>Start with target emotion and sensory memory: Ask "How do you wish you felt right now?" Then: "Tell me a time you felt [loved], even if it was teeny tiny." Get sensory details. Have the client breathe it in: "I am loved and I am joyful and I like it." This creates the neuropathway ("neurons that fire together wire together").</w:t>
+      </w:r>
+    </w:p>
+    <w:p>
+      <w:pPr>
+        <w:pStyle w:val="ListBullet"/>
+      </w:pPr>
+      <w:r>
+        <w:t>Hypnotic intention based on primary wound: For Abandonment — "You will never abandon yourself again. Listen to your body's needs." For Betrayal — "You will never betray yourself. No dangerous situations." For Shame — "Watch how you talk to yourself. Talk like your best friend."</w:t>
+      </w:r>
+    </w:p>
+    <w:p>
+      <w:pPr>
+        <w:pStyle w:val="ListBullet"/>
+      </w:pPr>
+      <w:r>
+        <w:t>Same trigger, new healthier behavior, superior result: Identify the client's trigger (e.g., going to mom's house), establish a new behavior (shoulders back, expose heart, breathe in the best of your adult self), and anchor the superior result (completely different experience even though there was trauma).</w:t>
+      </w:r>
+    </w:p>
+    <w:p>
+      <w:pPr>
+        <w:pStyle w:val="ListBullet"/>
+      </w:pPr>
+      <w:r>
+        <w:t>As a hypnotherapist, not a psychologist: Don't analyze how family of origin impacts the present. Instead focus on: what are you suggestible to? What is the trigger? What is the new healthier behavior?</w:t>
       </w:r>
     </w:p>
     <w:p>

</xml_diff>